<commit_message>
fix: onboarding doc uses exact template, pixel perfect match
</commit_message>
<xml_diff>
--- a/functions/generate_onboarding/onboarding_template.docx
+++ b/functions/generate_onboarding/onboarding_template.docx
@@ -21,9 +21,7 @@
           <w:szCs w:val="32"/>
           <w:rtl w:val="0"/>
         </w:rPr>
-        <w:t xml:space="preserve">ANGEL INTERNATIONAL SCHOOL</w:t>
-        <w:br w:type="textWrapping"/>
-        <w:t xml:space="preserve">A.Y 2026-27</w:t>
+        <w:t xml:space="preserve">The Keystone Ankuram School, Pune [A.Y 2026-27]</w:t>
       </w:r>
     </w:p>
     <w:p>
@@ -62,7 +60,7 @@
           <w:color w:val="000000"/>
           <w:rtl w:val="0"/>
         </w:rPr>
-        <w:t xml:space="preserve">Getting Started with / Setup Guide for Holistic Progress Cards (HPC)</w:t>
+        <w:t xml:space="preserve">Getting Started with/Setup Guide for Holistic Progress Cards (HPC)</w:t>
       </w:r>
     </w:p>
     <w:p>
@@ -91,7 +89,7 @@
           <w:shd w:fill="fff2cc" w:val="clear"/>
           <w:rtl w:val="0"/>
         </w:rPr>
-        <w:t xml:space="preserve">This document outlines all the information we need to set up the HPC App for the school</w:t>
+        <w:t xml:space="preserve">This guide outlines the info required to set up the ‘App’ and prepare the ‘HPCs’.</w:t>
       </w:r>
       <w:r>
         <w:rPr>
@@ -178,9 +176,9 @@
     <w:tbl>
       <w:tblPr>
         <w:tblStyle w:val="Table1"/>
-        <w:tblW w:w="8280.0" w:type="dxa"/>
+        <w:tblW w:w="10935.0" w:type="dxa"/>
         <w:jc w:val="left"/>
-        <w:tblInd w:w="720.0" w:type="dxa"/>
+        <w:tblInd w:w="-915.0" w:type="dxa"/>
         <w:tblBorders>
           <w:top w:color="000000" w:space="0" w:sz="8" w:val="single"/>
           <w:left w:color="000000" w:space="0" w:sz="8" w:val="single"/>
@@ -193,14 +191,14 @@
         <w:tblLook w:val="0600"/>
       </w:tblPr>
       <w:tblGrid>
-        <w:gridCol w:w="3720"/>
-        <w:gridCol w:w="1065"/>
-        <w:gridCol w:w="3495"/>
+        <w:gridCol w:w="5400"/>
+        <w:gridCol w:w="660"/>
+        <w:gridCol w:w="4875"/>
         <w:tblGridChange w:id="0">
           <w:tblGrid>
-            <w:gridCol w:w="3720"/>
-            <w:gridCol w:w="1065"/>
-            <w:gridCol w:w="3495"/>
+            <w:gridCol w:w="5400"/>
+            <w:gridCol w:w="660"/>
+            <w:gridCol w:w="4875"/>
           </w:tblGrid>
         </w:tblGridChange>
       </w:tblGrid>
@@ -210,6 +208,87 @@
           <w:trHeight w:val="440" w:hRule="atLeast"/>
           <w:tblHeader w:val="0"/>
         </w:trPr>
+        <w:tc>
+          <w:tcPr>
+            <w:shd w:fill="b6d7a8" w:val="clear"/>
+            <w:tcMar>
+              <w:top w:w="100.0" w:type="dxa"/>
+              <w:left w:w="100.0" w:type="dxa"/>
+              <w:bottom w:w="100.0" w:type="dxa"/>
+              <w:right w:w="100.0" w:type="dxa"/>
+            </w:tcMar>
+            <w:vAlign w:val="top"/>
+          </w:tcPr>
+          <w:p>
+            <w:pPr>
+              <w:spacing w:after="240" w:before="240" w:lineRule="auto"/>
+              <w:jc w:val="center"/>
+              <w:rPr>
+                <w:sz w:val="24"/>
+                <w:szCs w:val="24"/>
+              </w:rPr>
+            </w:pPr>
+            <w:r>
+              <w:rPr>
+                <w:sz w:val="24"/>
+                <w:szCs w:val="24"/>
+                <w:rtl w:val="0"/>
+              </w:rPr>
+              <w:t xml:space="preserve">Direct Entry in our App </w:t>
+              <w:br w:type="textWrapping"/>
+            </w:r>
+            <w:r>
+              <w:rPr>
+                <w:b w:val="1"/>
+                <w:bCs w:val="1"/>
+                <w:sz w:val="24"/>
+                <w:szCs w:val="24"/>
+                <w:rtl w:val="0"/>
+              </w:rPr>
+              <w:t xml:space="preserve">(Highly Recommended)</w:t>
+            </w:r>
+            <w:r>
+              <w:rPr>
+                <w:rtl w:val="0"/>
+              </w:rPr>
+            </w:r>
+          </w:p>
+        </w:tc>
+        <w:tc>
+          <w:tcPr>
+            <w:vMerge w:val="restart"/>
+            <w:shd w:fill="d9ead3" w:val="clear"/>
+            <w:tcMar>
+              <w:top w:w="100.0" w:type="dxa"/>
+              <w:left w:w="100.0" w:type="dxa"/>
+              <w:bottom w:w="100.0" w:type="dxa"/>
+              <w:right w:w="100.0" w:type="dxa"/>
+            </w:tcMar>
+            <w:vAlign w:val="center"/>
+          </w:tcPr>
+          <w:p>
+            <w:pPr>
+              <w:spacing w:after="240" w:before="240" w:lineRule="auto"/>
+              <w:jc w:val="center"/>
+              <w:rPr>
+                <w:b w:val="1"/>
+                <w:bCs w:val="1"/>
+                <w:sz w:val="24"/>
+                <w:szCs w:val="24"/>
+              </w:rPr>
+            </w:pPr>
+            <w:r>
+              <w:rPr>
+                <w:b w:val="1"/>
+                <w:bCs w:val="1"/>
+                <w:sz w:val="24"/>
+                <w:szCs w:val="24"/>
+                <w:rtl w:val="0"/>
+              </w:rPr>
+              <w:t xml:space="preserve">OR</w:t>
+            </w:r>
+          </w:p>
+        </w:tc>
         <w:tc>
           <w:tcPr>
             <w:shd w:fill="fff2cc" w:val="clear"/>
@@ -226,87 +305,6 @@
               <w:spacing w:after="240" w:before="240" w:lineRule="auto"/>
               <w:jc w:val="center"/>
               <w:rPr>
-                <w:sz w:val="24"/>
-                <w:szCs w:val="24"/>
-              </w:rPr>
-            </w:pPr>
-            <w:r>
-              <w:rPr>
-                <w:sz w:val="24"/>
-                <w:szCs w:val="24"/>
-                <w:rtl w:val="0"/>
-              </w:rPr>
-              <w:t xml:space="preserve">Direct Entry in our App </w:t>
-              <w:br w:type="textWrapping"/>
-            </w:r>
-            <w:r>
-              <w:rPr>
-                <w:b w:val="1"/>
-                <w:bCs w:val="1"/>
-                <w:sz w:val="24"/>
-                <w:szCs w:val="24"/>
-                <w:rtl w:val="0"/>
-              </w:rPr>
-              <w:t xml:space="preserve">(Highly Recommended)</w:t>
-            </w:r>
-            <w:r>
-              <w:rPr>
-                <w:rtl w:val="0"/>
-              </w:rPr>
-            </w:r>
-          </w:p>
-        </w:tc>
-        <w:tc>
-          <w:tcPr>
-            <w:vMerge w:val="restart"/>
-            <w:shd w:fill="b6d7a8" w:val="clear"/>
-            <w:tcMar>
-              <w:top w:w="100.0" w:type="dxa"/>
-              <w:left w:w="100.0" w:type="dxa"/>
-              <w:bottom w:w="100.0" w:type="dxa"/>
-              <w:right w:w="100.0" w:type="dxa"/>
-            </w:tcMar>
-            <w:vAlign w:val="center"/>
-          </w:tcPr>
-          <w:p>
-            <w:pPr>
-              <w:spacing w:after="240" w:before="240" w:lineRule="auto"/>
-              <w:jc w:val="center"/>
-              <w:rPr>
-                <w:b w:val="1"/>
-                <w:bCs w:val="1"/>
-                <w:sz w:val="24"/>
-                <w:szCs w:val="24"/>
-              </w:rPr>
-            </w:pPr>
-            <w:r>
-              <w:rPr>
-                <w:b w:val="1"/>
-                <w:bCs w:val="1"/>
-                <w:sz w:val="24"/>
-                <w:szCs w:val="24"/>
-                <w:rtl w:val="0"/>
-              </w:rPr>
-              <w:t xml:space="preserve">OR</w:t>
-            </w:r>
-          </w:p>
-        </w:tc>
-        <w:tc>
-          <w:tcPr>
-            <w:shd w:fill="d9ead3" w:val="clear"/>
-            <w:tcMar>
-              <w:top w:w="100.0" w:type="dxa"/>
-              <w:left w:w="100.0" w:type="dxa"/>
-              <w:bottom w:w="100.0" w:type="dxa"/>
-              <w:right w:w="100.0" w:type="dxa"/>
-            </w:tcMar>
-            <w:vAlign w:val="top"/>
-          </w:tcPr>
-          <w:p>
-            <w:pPr>
-              <w:spacing w:after="240" w:before="240" w:lineRule="auto"/>
-              <w:jc w:val="center"/>
-              <w:rPr>
                 <w:sz w:val="26"/>
                 <w:szCs w:val="26"/>
               </w:rPr>
@@ -330,7 +328,7 @@
       <w:tr>
         <w:trPr>
           <w:cantSplit w:val="0"/>
-          <w:trHeight w:val="440" w:hRule="atLeast"/>
+          <w:trHeight w:val="3533.73046875" w:hRule="atLeast"/>
           <w:tblHeader w:val="0"/>
         </w:trPr>
         <w:tc>
@@ -358,7 +356,7 @@
                 <w:szCs w:val="24"/>
                 <w:rtl w:val="0"/>
               </w:rPr>
-              <w:t xml:space="preserve">The app supports all activities required for creating the HPC. All the </w:t>
+              <w:t xml:space="preserve">Our app supports all activities required for creating the HPC. All the </w:t>
             </w:r>
             <w:r>
               <w:rPr>
@@ -401,7 +399,7 @@
         <w:tc>
           <w:tcPr>
             <w:vMerge w:val="continue"/>
-            <w:shd w:fill="b6d7a8" w:val="clear"/>
+            <w:shd w:fill="d9ead3" w:val="clear"/>
             <w:tcMar>
               <w:top w:w="100.0" w:type="dxa"/>
               <w:left w:w="100.0" w:type="dxa"/>
@@ -452,7 +450,6 @@
                 <w:rtl w:val="0"/>
               </w:rPr>
               <w:t xml:space="preserve">If you already use an ERP/LMS or other platform for marks entry, you may export the required data and share it in Excel format. </w:t>
-              <w:br w:type="textWrapping"/>
               <w:br w:type="textWrapping"/>
             </w:r>
             <w:r>
@@ -792,6 +789,7 @@
       <w:tr>
         <w:trPr>
           <w:cantSplit w:val="0"/>
+          <w:trHeight w:val="815.9765625" w:hRule="atLeast"/>
           <w:tblHeader w:val="0"/>
         </w:trPr>
         <w:tc>
@@ -864,6 +862,7 @@
       <w:tr>
         <w:trPr>
           <w:cantSplit w:val="0"/>
+          <w:trHeight w:val="1334.8828125" w:hRule="atLeast"/>
           <w:tblHeader w:val="0"/>
         </w:trPr>
         <w:tc>
@@ -955,6 +954,7 @@
       <w:tr>
         <w:trPr>
           <w:cantSplit w:val="0"/>
+          <w:trHeight w:val="947.9296875" w:hRule="atLeast"/>
           <w:tblHeader w:val="0"/>
         </w:trPr>
         <w:tc>
@@ -1014,7 +1014,6 @@
                 <w:szCs w:val="24"/>
                 <w:rtl w:val="0"/>
               </w:rPr>
-              <w:br w:type="textWrapping"/>
               <w:t xml:space="preserve">If the teacher is a Class Teacher, kindly mention the corresponding grade and section.</w:t>
             </w:r>
             <w:r>
@@ -1225,8 +1224,8 @@
       </w:tblGrid>
       <w:tr>
         <w:trPr>
-          <w:cantSplit w:val="0"/>
-          <w:trHeight w:val="755.9765625" w:hRule="atLeast"/>
+          <w:cantSplit w:val="1"/>
+          <w:trHeight w:val="530.9765625" w:hRule="atLeast"/>
           <w:tblHeader w:val="0"/>
         </w:trPr>
         <w:tc>
@@ -1305,7 +1304,7 @@
       </w:tr>
       <w:tr>
         <w:trPr>
-          <w:cantSplit w:val="0"/>
+          <w:cantSplit w:val="1"/>
           <w:tblHeader w:val="0"/>
         </w:trPr>
         <w:tc>
@@ -1384,7 +1383,7 @@
       </w:tr>
       <w:tr>
         <w:trPr>
-          <w:cantSplit w:val="0"/>
+          <w:cantSplit w:val="1"/>
           <w:tblHeader w:val="0"/>
         </w:trPr>
         <w:tc>
@@ -1463,7 +1462,7 @@
       </w:tr>
       <w:tr>
         <w:trPr>
-          <w:cantSplit w:val="0"/>
+          <w:cantSplit w:val="1"/>
           <w:tblHeader w:val="0"/>
         </w:trPr>
         <w:tc>
@@ -1542,7 +1541,7 @@
       </w:tr>
       <w:tr>
         <w:trPr>
-          <w:cantSplit w:val="0"/>
+          <w:cantSplit w:val="1"/>
           <w:tblHeader w:val="0"/>
         </w:trPr>
         <w:tc>
@@ -1621,7 +1620,7 @@
       </w:tr>
       <w:tr>
         <w:trPr>
-          <w:cantSplit w:val="0"/>
+          <w:cantSplit w:val="1"/>
           <w:tblHeader w:val="0"/>
         </w:trPr>
         <w:tc>

</xml_diff>